<commit_message>
feat(brd): richer export context, template generator, and docxtpl reference
- Add brd.overview, brd.process_flow, diagram_type, and full workflow_sections with diagrams
- Commit generated flowlens-brd-template.docx and build_flowlens_brd_template.py
- Document all brd.* placeholders in BRD_DOCXTPL_REFERENCE.md

Made-with: Cursor
</commit_message>
<xml_diff>
--- a/docs/templates/flowlens-brd-template.docx
+++ b/docs/templates/flowlens-brd-template.docx
@@ -4,38 +4,76 @@
   <w:body>
     <w:p>
       <w:pPr>
-        <w:pStyle w:val="Title"/>
+        <w:jc w:val="center"/>
       </w:pPr>
       <w:r>
+        <w:rPr>
+          <w:b/>
+          <w:sz w:val="36"/>
+        </w:rPr>
         <w:t>FlowLens Business Requirements Document</w:t>
+      </w:r>
+    </w:p>
+    <w:p/>
+    <w:p>
+      <w:r>
+        <w:rPr>
+          <w:b/>
+        </w:rPr>
+        <w:t>Business Requirements</w:t>
       </w:r>
     </w:p>
     <w:p>
       <w:r>
-        <w:t>Document Title: {{ brd.title }}</w:t>
+        <w:t>{{ brd.title }}</w:t>
       </w:r>
     </w:p>
     <w:p>
       <w:r>
-        <w:t>Generated At: {{ brd.generated_at }}</w:t>
+        <w:t>Owner: {{ brd.owner_id }} · Session: {{ brd.session_id }} · Status: {{ brd.status }}</w:t>
       </w:r>
     </w:p>
     <w:p>
       <w:r>
-        <w:t>Owner: {{ brd.owner_id }}</w:t>
+        <w:t>Generated: {{ brd.generated_at }} · Diagram: {{ brd.diagram_type }}</w:t>
+      </w:r>
+    </w:p>
+    <w:p/>
+    <w:p>
+      <w:r>
+        <w:rPr>
+          <w:b/>
+        </w:rPr>
+        <w:t>Document overview</w:t>
       </w:r>
     </w:p>
     <w:p>
       <w:r>
-        <w:t>Status: {{ brd.status }}</w:t>
+        <w:t>{{ brd.overview.process_name }}</w:t>
       </w:r>
     </w:p>
     <w:p>
-      <w:pPr>
-        <w:pStyle w:val="Heading1"/>
-      </w:pPr>
       <w:r>
-        <w:t>1. Business Objective</w:t>
+        <w:t>{{ brd.overview.document_owner }}</w:t>
+      </w:r>
+    </w:p>
+    <w:p>
+      <w:r>
+        <w:t>{{ brd.overview.document_status }}</w:t>
+      </w:r>
+    </w:p>
+    <w:p>
+      <w:r>
+        <w:t>{{ brd.overview.process_summary }}</w:t>
+      </w:r>
+    </w:p>
+    <w:p/>
+    <w:p>
+      <w:r>
+        <w:rPr>
+          <w:b/>
+        </w:rPr>
+        <w:t>Business objective</w:t>
       </w:r>
     </w:p>
     <w:p>
@@ -43,12 +81,13 @@
         <w:t>{{ brd.business_objective }}</w:t>
       </w:r>
     </w:p>
+    <w:p/>
     <w:p>
-      <w:pPr>
-        <w:pStyle w:val="Heading1"/>
-      </w:pPr>
       <w:r>
-        <w:t>2. Scope</w:t>
+        <w:rPr>
+          <w:b/>
+        </w:rPr>
+        <w:t>Scope</w:t>
       </w:r>
     </w:p>
     <w:p>
@@ -56,12 +95,13 @@
         <w:t>{{ brd.scope }}</w:t>
       </w:r>
     </w:p>
+    <w:p/>
     <w:p>
-      <w:pPr>
-        <w:pStyle w:val="Heading1"/>
-      </w:pPr>
       <w:r>
-        <w:t>3. Current-State Summary</w:t>
+        <w:rPr>
+          <w:b/>
+        </w:rPr>
+        <w:t>Current-state summary</w:t>
       </w:r>
     </w:p>
     <w:p>
@@ -69,25 +109,23 @@
         <w:t>{{ brd.current_state_summary }}</w:t>
       </w:r>
     </w:p>
+    <w:p/>
     <w:p>
-      <w:pPr>
-        <w:pStyle w:val="Heading1"/>
-      </w:pPr>
       <w:r>
-        <w:t>4. Stakeholders</w:t>
+        <w:rPr>
+          <w:b/>
+        </w:rPr>
+        <w:t>Stakeholders</w:t>
       </w:r>
     </w:p>
     <w:p>
       <w:r>
-        <w:t>{% for item in brd.stakeholders %}</w:t>
+        <w:t>{% for s in brd.stakeholders %}</w:t>
       </w:r>
     </w:p>
     <w:p>
-      <w:pPr>
-        <w:pStyle w:val="ListBullet"/>
-      </w:pPr>
       <w:r>
-        <w:t>{{ item.name }} | {{ item.role }} | {{ item.interest }}</w:t>
+        <w:t>{{ s.name }} — {{ s.role }}: {{ s.interest }}</w:t>
       </w:r>
     </w:p>
     <w:p>
@@ -95,25 +133,37 @@
         <w:t>{% endfor %}</w:t>
       </w:r>
     </w:p>
+    <w:p/>
     <w:p>
-      <w:pPr>
-        <w:pStyle w:val="Heading1"/>
-      </w:pPr>
       <w:r>
-        <w:t>5. Application Landscape</w:t>
+        <w:rPr>
+          <w:b/>
+        </w:rPr>
+        <w:t>Application landscape</w:t>
       </w:r>
     </w:p>
     <w:p>
       <w:r>
-        <w:t>{% for application in brd.applications %}</w:t>
+        <w:t>{% for app in brd.applications %}{{ app }}{% if not loop.last %}, {% endif %}{% endfor %}</w:t>
+      </w:r>
+    </w:p>
+    <w:p/>
+    <w:p>
+      <w:r>
+        <w:rPr>
+          <w:b/>
+        </w:rPr>
+        <w:t>Requirements</w:t>
       </w:r>
     </w:p>
     <w:p>
-      <w:pPr>
-        <w:pStyle w:val="ListBullet"/>
-      </w:pPr>
       <w:r>
-        <w:t>{{ application }}</w:t>
+        <w:t>{% for req in brd.requirements %}</w:t>
+      </w:r>
+    </w:p>
+    <w:p>
+      <w:r>
+        <w:t>{{ req.id }} [{{ req.category }}]: {{ req.statement }} — {{ req.rationale }}</w:t>
       </w:r>
     </w:p>
     <w:p>
@@ -121,30 +171,23 @@
         <w:t>{% endfor %}</w:t>
       </w:r>
     </w:p>
+    <w:p/>
     <w:p>
-      <w:pPr>
-        <w:pStyle w:val="Heading1"/>
-      </w:pPr>
       <w:r>
-        <w:t>6. Business Requirements</w:t>
+        <w:rPr>
+          <w:b/>
+        </w:rPr>
+        <w:t>Business rules and notes</w:t>
       </w:r>
     </w:p>
     <w:p>
       <w:r>
-        <w:t>{% for item in brd.requirements %}</w:t>
-      </w:r>
-    </w:p>
-    <w:p>
-      <w:pPr>
-        <w:pStyle w:val="ListNumber"/>
-      </w:pPr>
-      <w:r>
-        <w:t>{{ item.id }} | {{ item.category }} | {{ item.statement }}</w:t>
+        <w:t>{% for rule in brd.business_rules %}</w:t>
       </w:r>
     </w:p>
     <w:p>
       <w:r>
-        <w:t>Rationale: {{ item.rationale }}</w:t>
+        <w:t>{{ rule }}</w:t>
       </w:r>
     </w:p>
     <w:p>
@@ -152,25 +195,23 @@
         <w:t>{% endfor %}</w:t>
       </w:r>
     </w:p>
+    <w:p/>
     <w:p>
-      <w:pPr>
-        <w:pStyle w:val="Heading1"/>
-      </w:pPr>
       <w:r>
-        <w:t>7. Business Rules</w:t>
+        <w:rPr>
+          <w:b/>
+        </w:rPr>
+        <w:t>Assumptions</w:t>
       </w:r>
     </w:p>
     <w:p>
       <w:r>
-        <w:t>{% for item in brd.business_rules %}</w:t>
+        <w:t>{% for a in brd.assumptions %}</w:t>
       </w:r>
     </w:p>
     <w:p>
-      <w:pPr>
-        <w:pStyle w:val="ListBullet"/>
-      </w:pPr>
       <w:r>
-        <w:t>{{ item }}</w:t>
+        <w:t>{{ a }}</w:t>
       </w:r>
     </w:p>
     <w:p>
@@ -178,25 +219,23 @@
         <w:t>{% endfor %}</w:t>
       </w:r>
     </w:p>
+    <w:p/>
     <w:p>
-      <w:pPr>
-        <w:pStyle w:val="Heading1"/>
-      </w:pPr>
       <w:r>
-        <w:t>8. Assumptions</w:t>
+        <w:rPr>
+          <w:b/>
+        </w:rPr>
+        <w:t>Risks and exceptions</w:t>
       </w:r>
     </w:p>
     <w:p>
       <w:r>
-        <w:t>{% for item in brd.assumptions %}</w:t>
+        <w:t>{% for r in brd.risks_and_exceptions %}</w:t>
       </w:r>
     </w:p>
     <w:p>
-      <w:pPr>
-        <w:pStyle w:val="ListBullet"/>
-      </w:pPr>
       <w:r>
-        <w:t>{{ item }}</w:t>
+        <w:t>{{ r }}</w:t>
       </w:r>
     </w:p>
     <w:p>
@@ -204,25 +243,23 @@
         <w:t>{% endfor %}</w:t>
       </w:r>
     </w:p>
+    <w:p/>
     <w:p>
-      <w:pPr>
-        <w:pStyle w:val="Heading1"/>
-      </w:pPr>
       <w:r>
-        <w:t>9. Risks and Exceptions</w:t>
+        <w:rPr>
+          <w:b/>
+        </w:rPr>
+        <w:t>Workflow evidence (by section)</w:t>
       </w:r>
     </w:p>
     <w:p>
       <w:r>
-        <w:t>{% for item in brd.risks_and_exceptions %}</w:t>
+        <w:t>{% for sec in brd.workflow_sections %}</w:t>
       </w:r>
     </w:p>
     <w:p>
-      <w:pPr>
-        <w:pStyle w:val="ListBullet"/>
-      </w:pPr>
       <w:r>
-        <w:t>{{ item }}</w:t>
+        <w:t>{{ sec.title }}: {{ sec.summary }} ({{ sec.step_count }} steps)</w:t>
       </w:r>
     </w:p>
     <w:p>
@@ -230,81 +267,32 @@
         <w:t>{% endfor %}</w:t>
       </w:r>
     </w:p>
+    <w:p/>
     <w:p>
-      <w:pPr>
-        <w:pStyle w:val="Heading1"/>
-      </w:pPr>
       <w:r>
-        <w:t>10. Workflow Evidence</w:t>
+        <w:rPr>
+          <w:b/>
+        </w:rPr>
+        <w:t>Process flow (combined)</w:t>
       </w:r>
     </w:p>
     <w:p>
       <w:r>
-        <w:t>{% for section in brd.workflow_sections %}</w:t>
+        <w:t>{% if brd.process_flow.diagram_image %}{{ brd.process_flow.diagram_image }}{% endif %}</w:t>
       </w:r>
     </w:p>
+    <w:p/>
     <w:p>
-      <w:pPr>
-        <w:pStyle w:val="Heading2"/>
-      </w:pPr>
       <w:r>
-        <w:t>{{ section.title }}</w:t>
+        <w:rPr>
+          <w:b/>
+        </w:rPr>
+        <w:t>Evidence summary</w:t>
       </w:r>
     </w:p>
     <w:p>
       <w:r>
-        <w:t>{{ section.summary }}</w:t>
-      </w:r>
-    </w:p>
-    <w:p>
-      <w:r>
-        <w:t>Observed steps: {{ section.step_count }}</w:t>
-      </w:r>
-    </w:p>
-    <w:p>
-      <w:r>
-        <w:t>{% for step in section.steps %}</w:t>
-      </w:r>
-    </w:p>
-    <w:p>
-      <w:pPr>
-        <w:pStyle w:val="ListBullet2"/>
-      </w:pPr>
-      <w:r>
-        <w:t>Step {{ step.step_number }}. {{ step.action_text }}</w:t>
-      </w:r>
-    </w:p>
-    <w:p>
-      <w:r>
-        <w:t>{% endfor %}</w:t>
-      </w:r>
-    </w:p>
-    <w:p>
-      <w:r>
-        <w:t>{% endfor %}</w:t>
-      </w:r>
-    </w:p>
-    <w:p>
-      <w:pPr>
-        <w:pStyle w:val="Heading1"/>
-      </w:pPr>
-      <w:r>
-        <w:t>11. Evidence Summary</w:t>
-      </w:r>
-    </w:p>
-    <w:p>
-      <w:r>
-        <w:t>Workflow sections: {{ brd.evidence_summary.workflow_sections }}</w:t>
-      </w:r>
-    </w:p>
-    <w:p>
-      <w:r>
-        <w:t>Observed steps: {{ brd.evidence_summary.observed_steps }}</w:t>
-      </w:r>
-    </w:p>
-    <w:p>
-      <w:r>
-        <w:t>Captured notes: {{ brd.evidence_summary.captured_notes }}</w:t>
+        <w:t>Sections: {{ brd.evidence_summary.workflow_sections }} · Steps: {{ brd.evidence_summary.observed_steps }} · Notes: {{ brd.evidence_summary.captured_notes }}</w:t>
       </w:r>
     </w:p>
     <w:sectPr>

</xml_diff>

<commit_message>
feat: BRD pipeline, service package layout, export text enrichment
- Reorganize backend services into domain subpackages (auth, billing, documents, draft_session, etc.)
- Add document export enrichment pipeline, BRD canonical sections, migration for export_text_enrichment_json
- BRD lean mode, optional diagram generation, bounded transcript-to-steps, capability classification gating
- Persist LLM usage metrics on draft sessions; surface token totals on session list UI
- Update templates, worker stages, and tests for new wiring

Made-with: Cursor
</commit_message>
<xml_diff>
--- a/docs/templates/flowlens-brd-template.docx
+++ b/docs/templates/flowlens-brd-template.docx
@@ -9,42 +9,265 @@
       <w:r>
         <w:rPr>
           <w:b/>
-          <w:sz w:val="36"/>
+          <w:sz w:val="40"/>
         </w:rPr>
         <w:t>FlowLens Business Requirements Document</w:t>
       </w:r>
     </w:p>
+    <w:p>
+      <w:pPr>
+        <w:jc w:val="center"/>
+      </w:pPr>
+      <w:r>
+        <w:rPr>
+          <w:i/>
+        </w:rPr>
+        <w:t>{{ brd.title }}</w:t>
+      </w:r>
+    </w:p>
     <w:p/>
     <w:p>
+      <w:pPr>
+        <w:jc w:val="center"/>
+      </w:pPr>
       <w:r>
-        <w:rPr>
-          <w:b/>
-        </w:rPr>
-        <w:t>Business Requirements</w:t>
+        <w:t>Owner: {{ brd.owner_id }}  |  Session: {{ brd.session_id }}  |  Status: {{ brd.status }}</w:t>
+        <w:br/>
+        <w:t>Generated: {{ brd.generated_at }}  |  Diagram type: {{ brd.diagram_type }}</w:t>
+      </w:r>
+    </w:p>
+    <w:p/>
+    <w:p>
+      <w:pPr>
+        <w:pStyle w:val="IntenseQuote"/>
+      </w:pPr>
+      <w:r>
+        <w:t>This document follows the Business Requirements Document (BRD) structure: executive summary through approval and sign-off. Section bodies are filled from the session evidence where available; placeholders indicate items to complete with stakeholders.</w:t>
       </w:r>
     </w:p>
     <w:p>
       <w:r>
-        <w:t>{{ brd.title }}</w:t>
+        <w:t>{% if brd.multi_process %}</w:t>
       </w:r>
     </w:p>
     <w:p>
       <w:r>
-        <w:t>Owner: {{ brd.owner_id }} · Session: {{ brd.session_id }} · Status: {{ brd.status }}</w:t>
+        <w:t>{% for block in brd.process_document_blocks %}</w:t>
+      </w:r>
+    </w:p>
+    <w:p/>
+    <w:p>
+      <w:pPr>
+        <w:pStyle w:val="Heading2"/>
+      </w:pPr>
+      <w:r>
+        <w:t>{{ block.process_title }}</w:t>
+      </w:r>
+    </w:p>
+    <w:p>
+      <w:pPr>
+        <w:pStyle w:val="Heading1"/>
+      </w:pPr>
+      <w:r>
+        <w:t>Standard BRD sections</w:t>
       </w:r>
     </w:p>
     <w:p>
       <w:r>
-        <w:t>Generated: {{ brd.generated_at }} · Diagram: {{ brd.diagram_type }}</w:t>
+        <w:t>{% for row in block.canonical_sections %}</w:t>
+      </w:r>
+    </w:p>
+    <w:p>
+      <w:pPr>
+        <w:pStyle w:val="Heading2"/>
+      </w:pPr>
+      <w:r>
+        <w:t>{{ row.ref }} {{ row.title }}</w:t>
+      </w:r>
+    </w:p>
+    <w:p>
+      <w:r>
+        <w:t>{{ row.body }}</w:t>
+      </w:r>
+    </w:p>
+    <w:p>
+      <w:r>
+        <w:t>{% endfor %}</w:t>
       </w:r>
     </w:p>
     <w:p/>
     <w:p>
+      <w:pPr>
+        <w:pStyle w:val="Heading2"/>
+      </w:pPr>
       <w:r>
-        <w:rPr>
-          <w:b/>
-        </w:rPr>
-        <w:t>Document overview</w:t>
+        <w:t>Document overview (metadata)</w:t>
+      </w:r>
+    </w:p>
+    <w:p>
+      <w:r>
+        <w:t>{{ block.overview.process_name }}</w:t>
+      </w:r>
+    </w:p>
+    <w:p>
+      <w:r>
+        <w:t>{{ block.overview.document_owner }} · {{ block.overview.document_status }}</w:t>
+      </w:r>
+    </w:p>
+    <w:p>
+      <w:r>
+        <w:t>{{ block.overview.process_summary }}</w:t>
+      </w:r>
+    </w:p>
+    <w:p/>
+    <w:p>
+      <w:pPr>
+        <w:pStyle w:val="Heading2"/>
+      </w:pPr>
+      <w:r>
+        <w:t>Structured requirements (BR-###)</w:t>
+      </w:r>
+    </w:p>
+    <w:p>
+      <w:r>
+        <w:t>{% for req in block.requirements %}</w:t>
+      </w:r>
+    </w:p>
+    <w:p>
+      <w:r>
+        <w:t>{{ req.id }} [{{ req.category }}]: {{ req.statement }} — {{ req.rationale }}</w:t>
+      </w:r>
+    </w:p>
+    <w:p>
+      <w:r>
+        <w:t>{% endfor %}</w:t>
+      </w:r>
+    </w:p>
+    <w:p/>
+    <w:p>
+      <w:pPr>
+        <w:pStyle w:val="Heading2"/>
+      </w:pPr>
+      <w:r>
+        <w:t>Business rules and notes</w:t>
+      </w:r>
+    </w:p>
+    <w:p>
+      <w:r>
+        <w:t>{% for rule in block.business_rules %}</w:t>
+      </w:r>
+    </w:p>
+    <w:p>
+      <w:r>
+        <w:t>{{ rule }}</w:t>
+      </w:r>
+    </w:p>
+    <w:p>
+      <w:r>
+        <w:t>{% endfor %}</w:t>
+      </w:r>
+    </w:p>
+    <w:p/>
+    <w:p>
+      <w:pPr>
+        <w:pStyle w:val="Heading2"/>
+      </w:pPr>
+      <w:r>
+        <w:t>Workflow evidence (by section)</w:t>
+      </w:r>
+    </w:p>
+    <w:p>
+      <w:r>
+        <w:t>{% for sec in block.workflow_sections %}</w:t>
+      </w:r>
+    </w:p>
+    <w:p>
+      <w:r>
+        <w:t>{{ sec.title }}: {{ sec.summary }} ({{ sec.step_count }} steps)</w:t>
+      </w:r>
+    </w:p>
+    <w:p>
+      <w:r>
+        <w:t>{% endfor %}</w:t>
+      </w:r>
+    </w:p>
+    <w:p/>
+    <w:p>
+      <w:pPr>
+        <w:pStyle w:val="Heading2"/>
+      </w:pPr>
+      <w:r>
+        <w:t>Process flow (diagram for this process)</w:t>
+      </w:r>
+    </w:p>
+    <w:p>
+      <w:r>
+        <w:t>{% if block.process_flow.diagram_image %}{{ block.process_flow.diagram_image }}{% endif %}</w:t>
+      </w:r>
+    </w:p>
+    <w:p/>
+    <w:p>
+      <w:pPr>
+        <w:pStyle w:val="Heading2"/>
+      </w:pPr>
+      <w:r>
+        <w:t>Evidence summary</w:t>
+      </w:r>
+    </w:p>
+    <w:p>
+      <w:r>
+        <w:t>Sections: {{ block.evidence_summary.workflow_sections }} · Steps: {{ block.evidence_summary.observed_steps }} · Notes: {{ block.evidence_summary.captured_notes }}</w:t>
+      </w:r>
+    </w:p>
+    <w:p>
+      <w:r>
+        <w:t>{% endfor %}</w:t>
+      </w:r>
+    </w:p>
+    <w:p>
+      <w:r>
+        <w:t>{% else %}</w:t>
+      </w:r>
+    </w:p>
+    <w:p/>
+    <w:p>
+      <w:pPr>
+        <w:pStyle w:val="Heading1"/>
+      </w:pPr>
+      <w:r>
+        <w:t>Standard BRD sections</w:t>
+      </w:r>
+    </w:p>
+    <w:p>
+      <w:r>
+        <w:t>{% for row in brd.canonical_sections %}</w:t>
+      </w:r>
+    </w:p>
+    <w:p>
+      <w:pPr>
+        <w:pStyle w:val="Heading2"/>
+      </w:pPr>
+      <w:r>
+        <w:t>{{ row.ref }} {{ row.title }}</w:t>
+      </w:r>
+    </w:p>
+    <w:p>
+      <w:r>
+        <w:t>{{ row.body }}</w:t>
+      </w:r>
+    </w:p>
+    <w:p>
+      <w:r>
+        <w:t>{% endfor %}</w:t>
+      </w:r>
+    </w:p>
+    <w:p/>
+    <w:p>
+      <w:pPr>
+        <w:pStyle w:val="Heading2"/>
+      </w:pPr>
+      <w:r>
+        <w:t>Document overview (metadata)</w:t>
       </w:r>
     </w:p>
     <w:p>
@@ -54,12 +277,7 @@
     </w:p>
     <w:p>
       <w:r>
-        <w:t>{{ brd.overview.document_owner }}</w:t>
-      </w:r>
-    </w:p>
-    <w:p>
-      <w:r>
-        <w:t>{{ brd.overview.document_status }}</w:t>
+        <w:t>{{ brd.overview.document_owner }} · {{ brd.overview.document_status }}</w:t>
       </w:r>
     </w:p>
     <w:p>
@@ -69,91 +287,11 @@
     </w:p>
     <w:p/>
     <w:p>
+      <w:pPr>
+        <w:pStyle w:val="Heading2"/>
+      </w:pPr>
       <w:r>
-        <w:rPr>
-          <w:b/>
-        </w:rPr>
-        <w:t>Business objective</w:t>
-      </w:r>
-    </w:p>
-    <w:p>
-      <w:r>
-        <w:t>{{ brd.business_objective }}</w:t>
-      </w:r>
-    </w:p>
-    <w:p/>
-    <w:p>
-      <w:r>
-        <w:rPr>
-          <w:b/>
-        </w:rPr>
-        <w:t>Scope</w:t>
-      </w:r>
-    </w:p>
-    <w:p>
-      <w:r>
-        <w:t>{{ brd.scope }}</w:t>
-      </w:r>
-    </w:p>
-    <w:p/>
-    <w:p>
-      <w:r>
-        <w:rPr>
-          <w:b/>
-        </w:rPr>
-        <w:t>Current-state summary</w:t>
-      </w:r>
-    </w:p>
-    <w:p>
-      <w:r>
-        <w:t>{{ brd.current_state_summary }}</w:t>
-      </w:r>
-    </w:p>
-    <w:p/>
-    <w:p>
-      <w:r>
-        <w:rPr>
-          <w:b/>
-        </w:rPr>
-        <w:t>Stakeholders</w:t>
-      </w:r>
-    </w:p>
-    <w:p>
-      <w:r>
-        <w:t>{% for s in brd.stakeholders %}</w:t>
-      </w:r>
-    </w:p>
-    <w:p>
-      <w:r>
-        <w:t>{{ s.name }} — {{ s.role }}: {{ s.interest }}</w:t>
-      </w:r>
-    </w:p>
-    <w:p>
-      <w:r>
-        <w:t>{% endfor %}</w:t>
-      </w:r>
-    </w:p>
-    <w:p/>
-    <w:p>
-      <w:r>
-        <w:rPr>
-          <w:b/>
-        </w:rPr>
-        <w:t>Application landscape</w:t>
-      </w:r>
-    </w:p>
-    <w:p>
-      <w:r>
-        <w:t>{% for app in brd.applications %}{{ app }}{% if not loop.last %}, {% endif %}{% endfor %}</w:t>
-      </w:r>
-    </w:p>
-    <w:p/>
-    <w:p>
-      <w:r>
-        <w:rPr>
-          <w:b/>
-        </w:rPr>
-        <w:t>Requirements</w:t>
+        <w:t>Structured requirements (BR-###)</w:t>
       </w:r>
     </w:p>
     <w:p>
@@ -173,10 +311,10 @@
     </w:p>
     <w:p/>
     <w:p>
+      <w:pPr>
+        <w:pStyle w:val="Heading2"/>
+      </w:pPr>
       <w:r>
-        <w:rPr>
-          <w:b/>
-        </w:rPr>
         <w:t>Business rules and notes</w:t>
       </w:r>
     </w:p>
@@ -197,58 +335,10 @@
     </w:p>
     <w:p/>
     <w:p>
+      <w:pPr>
+        <w:pStyle w:val="Heading2"/>
+      </w:pPr>
       <w:r>
-        <w:rPr>
-          <w:b/>
-        </w:rPr>
-        <w:t>Assumptions</w:t>
-      </w:r>
-    </w:p>
-    <w:p>
-      <w:r>
-        <w:t>{% for a in brd.assumptions %}</w:t>
-      </w:r>
-    </w:p>
-    <w:p>
-      <w:r>
-        <w:t>{{ a }}</w:t>
-      </w:r>
-    </w:p>
-    <w:p>
-      <w:r>
-        <w:t>{% endfor %}</w:t>
-      </w:r>
-    </w:p>
-    <w:p/>
-    <w:p>
-      <w:r>
-        <w:rPr>
-          <w:b/>
-        </w:rPr>
-        <w:t>Risks and exceptions</w:t>
-      </w:r>
-    </w:p>
-    <w:p>
-      <w:r>
-        <w:t>{% for r in brd.risks_and_exceptions %}</w:t>
-      </w:r>
-    </w:p>
-    <w:p>
-      <w:r>
-        <w:t>{{ r }}</w:t>
-      </w:r>
-    </w:p>
-    <w:p>
-      <w:r>
-        <w:t>{% endfor %}</w:t>
-      </w:r>
-    </w:p>
-    <w:p/>
-    <w:p>
-      <w:r>
-        <w:rPr>
-          <w:b/>
-        </w:rPr>
         <w:t>Workflow evidence (by section)</w:t>
       </w:r>
     </w:p>
@@ -269,11 +359,11 @@
     </w:p>
     <w:p/>
     <w:p>
+      <w:pPr>
+        <w:pStyle w:val="Heading2"/>
+      </w:pPr>
       <w:r>
-        <w:rPr>
-          <w:b/>
-        </w:rPr>
-        <w:t>Process flow (combined)</w:t>
+        <w:t>Process flow (combined diagram)</w:t>
       </w:r>
     </w:p>
     <w:p>
@@ -283,16 +373,21 @@
     </w:p>
     <w:p/>
     <w:p>
+      <w:pPr>
+        <w:pStyle w:val="Heading2"/>
+      </w:pPr>
       <w:r>
-        <w:rPr>
-          <w:b/>
-        </w:rPr>
         <w:t>Evidence summary</w:t>
       </w:r>
     </w:p>
     <w:p>
       <w:r>
         <w:t>Sections: {{ brd.evidence_summary.workflow_sections }} · Steps: {{ brd.evidence_summary.observed_steps }} · Notes: {{ brd.evidence_summary.captured_notes }}</w:t>
+      </w:r>
+    </w:p>
+    <w:p>
+      <w:r>
+        <w:t>{% endif %}</w:t>
       </w:r>
     </w:p>
     <w:sectPr>

</xml_diff>